<commit_message>
Fix mobile hero and Pals scroll alignment; add direct HR playlists
Co-authored-by: arena-agent <297053741+arena-agent@users.noreply.github.com>
</commit_message>
<xml_diff>
--- a/learning-library/out/Recruiter-TA-Library.docx
+++ b/learning-library/out/Recruiter-TA-Library.docx
@@ -93,7 +93,7 @@
         <w:rPr>
           <w:rFonts w:ascii="Calibri" w:hAnsi="Calibri"/>
         </w:rPr>
-        <w:t>This library has 8 stages and 26 resource cards, about 94 hours of study in total. At five hours a week that is roughly 20 weeks. 24 cards were confirmed free from provider pages; 2 are paid or conditional and are labelled on the card. The free set mixes video series, official documentation and written courses, as you asked.</w:t>
+        <w:t>This library has 8 stages and 27 resource cards, about 94 hours of study in total. At five hours a week that is roughly 20 weeks. 25 cards were confirmed free from provider pages; 2 are paid or conditional and are labelled on the card. The free set mixes video series, official documentation and written courses, as you asked.</w:t>
       </w:r>
     </w:p>
     <w:p>
@@ -1302,7 +1302,7 @@
         <w:rPr>
           <w:rFonts w:ascii="Calibri" w:hAnsi="Calibri"/>
         </w:rPr>
-        <w:t xml:space="preserve"> about 8 hours across weeks 1-2.</w:t>
+        <w:t xml:space="preserve"> about 8 hours across weeks 1-2. This includes a one-hour HR Essentials starter budget; use selected lessons, not both full playlists.</w:t>
       </w:r>
     </w:p>
     <w:p>
@@ -1377,7 +1377,7 @@
         <w:rPr>
           <w:rFonts w:ascii="Calibri" w:hAnsi="Calibri"/>
         </w:rPr>
-        <w:t xml:space="preserve"> 3.</w:t>
+        <w:t xml:space="preserve"> 4.</w:t>
       </w:r>
     </w:p>
     <w:p>
@@ -1388,7 +1388,7 @@
         <w:rPr>
           <w:rFonts w:ascii="Calibri" w:hAnsi="Calibri"/>
         </w:rPr>
-        <w:t>The HR Learning Lab: Talent Acquisition (video playlist)</w:t>
+        <w:t>The HR Learning Lab: HR Essentials (video playlist)</w:t>
       </w:r>
     </w:p>
     <w:p>
@@ -1416,7 +1416,7 @@
             <w:u w:val="single"/>
             <w:rFonts w:ascii="Calibri" w:hAnsi="Calibri"/>
           </w:rPr>
-          <w:t>Open the channel</w:t>
+          <w:t>Open the playlist</w:t>
         </w:r>
       </w:hyperlink>
     </w:p>
@@ -1474,7 +1474,7 @@
         <w:rPr>
           <w:rFonts w:ascii="Calibri" w:hAnsi="Calibri"/>
         </w:rPr>
-        <w:t xml:space="preserve"> About 2 hours for the short lessons</w:t>
+        <w:t xml:space="preserve"> 1 hour for starter lessons and notes (study budget)</w:t>
       </w:r>
     </w:p>
     <w:p>
@@ -1493,7 +1493,7 @@
         <w:rPr>
           <w:rFonts w:ascii="Calibri" w:hAnsi="Calibri"/>
         </w:rPr>
-        <w:t xml:space="preserve"> Short, beginner-oriented lessons on job analysis, workforce planning, recruiting, selection and hiring practice. The fastest way to hear the vocabulary before reading heavier material.</w:t>
+        <w:t xml:space="preserve"> Start with what HR does, the employee life cycle and the wider HR profession before specialising in talent acquisition.</w:t>
       </w:r>
     </w:p>
     <w:p>
@@ -1512,7 +1512,7 @@
         <w:rPr>
           <w:rFonts w:ascii="Calibri" w:hAnsi="Calibri"/>
         </w:rPr>
-        <w:t xml:space="preserve"> Watch the first five lessons and write a one-page diagram of the hiring lifecycle in your own words.</w:t>
+        <w:t xml:space="preserve"> Watch lessons 1-4, then sketch the employee life cycle and explain where recruitment fits. Use remaining study time for notes and review.</w:t>
       </w:r>
     </w:p>
     <w:p>
@@ -1531,7 +1531,7 @@
         <w:rPr>
           <w:rFonts w:ascii="Calibri" w:hAnsi="Calibri"/>
         </w:rPr>
-        <w:t xml:space="preserve"> Verified 2026-10-26: public channel, playlist described in the video description. No account or payment seen. The creator states the videos are produced using AI-supported tools, so treat them as a primer and confirm anything consequential against a primary source.</w:t>
+        <w:t xml:space="preserve"> Checked 2026-10-27: public HR Essentials playlist, 16 listed videos; description and initial lesson titles readable without sign-in. The fetch also exposed a YouTube error banner, so playback and mobile app handoff remain untested. Content developed by Dr. Heather Staples; videos produced using AI-supported tools. This is introductory study, not a professional qualification.</w:t>
       </w:r>
     </w:p>
     <w:p>
@@ -1542,7 +1542,7 @@
         <w:rPr>
           <w:rFonts w:ascii="Calibri" w:hAnsi="Calibri"/>
         </w:rPr>
-        <w:t>PRDV226: Introduction to Human Resource Management</w:t>
+        <w:t>The HR Learning Lab: Talent Acquisition (video playlist)</w:t>
       </w:r>
     </w:p>
     <w:p>
@@ -1561,9 +1561,163 @@
         <w:rPr>
           <w:rFonts w:ascii="Calibri" w:hAnsi="Calibri"/>
         </w:rPr>
+        <w:t xml:space="preserve"> HR Learning Lab (YouTube) - </w:t>
+      </w:r>
+      <w:hyperlink r:id="rId10">
+        <w:r>
+          <w:rPr>
+            <w:color w:val="12628F"/>
+            <w:u w:val="single"/>
+            <w:rFonts w:ascii="Calibri" w:hAnsi="Calibri"/>
+          </w:rPr>
+          <w:t>Open the playlist</w:t>
+        </w:r>
+      </w:hyperlink>
+    </w:p>
+    <w:p>
+      <w:pPr>
+        <w:pStyle w:val="ListBullet"/>
+        <w:spacing w:after="60"/>
+      </w:pPr>
+      <w:r>
+        <w:rPr>
+          <w:rFonts w:ascii="Calibri" w:hAnsi="Calibri"/>
+          <w:b/>
+        </w:rPr>
+        <w:t>Format:</w:t>
+      </w:r>
+      <w:r>
+        <w:rPr>
+          <w:rFonts w:ascii="Calibri" w:hAnsi="Calibri"/>
+        </w:rPr>
+        <w:t xml:space="preserve"> Free video series</w:t>
+      </w:r>
+    </w:p>
+    <w:p>
+      <w:pPr>
+        <w:pStyle w:val="ListBullet"/>
+        <w:spacing w:after="60"/>
+      </w:pPr>
+      <w:r>
+        <w:rPr>
+          <w:rFonts w:ascii="Calibri" w:hAnsi="Calibri"/>
+          <w:b/>
+        </w:rPr>
+        <w:t>Cost and access:</w:t>
+      </w:r>
+      <w:r>
+        <w:rPr>
+          <w:rFonts w:ascii="Calibri" w:hAnsi="Calibri"/>
+        </w:rPr>
+        <w:t xml:space="preserve"> Free</w:t>
+      </w:r>
+    </w:p>
+    <w:p>
+      <w:pPr>
+        <w:pStyle w:val="ListBullet"/>
+        <w:spacing w:after="60"/>
+      </w:pPr>
+      <w:r>
+        <w:rPr>
+          <w:rFonts w:ascii="Calibri" w:hAnsi="Calibri"/>
+          <w:b/>
+        </w:rPr>
+        <w:t>Time:</w:t>
+      </w:r>
+      <w:r>
+        <w:rPr>
+          <w:rFonts w:ascii="Calibri" w:hAnsi="Calibri"/>
+        </w:rPr>
+        <w:t xml:space="preserve"> About 2 hours of selected lessons and notes (study budget)</w:t>
+      </w:r>
+    </w:p>
+    <w:p>
+      <w:pPr>
+        <w:pStyle w:val="ListBullet"/>
+        <w:spacing w:after="60"/>
+      </w:pPr>
+      <w:r>
+        <w:rPr>
+          <w:rFonts w:ascii="Calibri" w:hAnsi="Calibri"/>
+          <w:b/>
+        </w:rPr>
+        <w:t>What it teaches, and why this stage:</w:t>
+      </w:r>
+      <w:r>
+        <w:rPr>
+          <w:rFonts w:ascii="Calibri" w:hAnsi="Calibri"/>
+        </w:rPr>
+        <w:t xml:space="preserve"> Short, beginner-oriented lessons on job analysis, workforce planning, recruiting, selection and hiring practice. The fastest way to hear the vocabulary before reading heavier material.</w:t>
+      </w:r>
+    </w:p>
+    <w:p>
+      <w:pPr>
+        <w:pStyle w:val="ListBullet"/>
+        <w:spacing w:after="60"/>
+      </w:pPr>
+      <w:r>
+        <w:rPr>
+          <w:rFonts w:ascii="Calibri" w:hAnsi="Calibri"/>
+          <w:b/>
+        </w:rPr>
+        <w:t>Next action:</w:t>
+      </w:r>
+      <w:r>
+        <w:rPr>
+          <w:rFonts w:ascii="Calibri" w:hAnsi="Calibri"/>
+        </w:rPr>
+        <w:t xml:space="preserve"> Watch the first five lessons and write a one-page diagram of the hiring lifecycle in your own words.</w:t>
+      </w:r>
+    </w:p>
+    <w:p>
+      <w:pPr>
+        <w:pStyle w:val="ListBullet"/>
+        <w:spacing w:after="60"/>
+      </w:pPr>
+      <w:r>
+        <w:rPr>
+          <w:rFonts w:ascii="Calibri" w:hAnsi="Calibri"/>
+          <w:b/>
+        </w:rPr>
+        <w:t>Verification:</w:t>
+      </w:r>
+      <w:r>
+        <w:rPr>
+          <w:rFonts w:ascii="Calibri" w:hAnsi="Calibri"/>
+        </w:rPr>
+        <w:t xml:space="preserve"> Checked 2026-10-27: public Talent Acquisition playlist, 43 listed videos, description and lesson titles readable without sign-in; playback and mobile app handoff not tested. Creator discloses AI-supported production; confirm consequential claims against primary sources.</w:t>
+      </w:r>
+    </w:p>
+    <w:p>
+      <w:pPr>
+        <w:pStyle w:val="Heading3"/>
+      </w:pPr>
+      <w:r>
+        <w:rPr>
+          <w:rFonts w:ascii="Calibri" w:hAnsi="Calibri"/>
+        </w:rPr>
+        <w:t>PRDV226: Introduction to Human Resource Management</w:t>
+      </w:r>
+    </w:p>
+    <w:p>
+      <w:pPr>
+        <w:pStyle w:val="ListBullet"/>
+        <w:spacing w:after="60"/>
+      </w:pPr>
+      <w:r>
+        <w:rPr>
+          <w:rFonts w:ascii="Calibri" w:hAnsi="Calibri"/>
+          <w:b/>
+        </w:rPr>
+        <w:t>Provider and link:</w:t>
+      </w:r>
+      <w:r>
+        <w:rPr>
+          <w:rFonts w:ascii="Calibri" w:hAnsi="Calibri"/>
+        </w:rPr>
         <w:t xml:space="preserve"> Saylor University - </w:t>
       </w:r>
-      <w:hyperlink r:id="rId10">
+      <w:hyperlink r:id="rId11">
         <w:r>
           <w:rPr>
             <w:color w:val="12628F"/>
@@ -1717,7 +1871,7 @@
         </w:rPr>
         <w:t xml:space="preserve"> OpenStax (Rice University) - </w:t>
       </w:r>
-      <w:hyperlink r:id="rId11">
+      <w:hyperlink r:id="rId12">
         <w:r>
           <w:rPr>
             <w:color w:val="12628F"/>
@@ -1995,7 +2149,7 @@
         </w:rPr>
         <w:t xml:space="preserve"> The Open University (OpenLearn) - </w:t>
       </w:r>
-      <w:hyperlink r:id="rId12">
+      <w:hyperlink r:id="rId13">
         <w:r>
           <w:rPr>
             <w:color w:val="12628F"/>
@@ -2148,160 +2302,6 @@
           <w:rFonts w:ascii="Calibri" w:hAnsi="Calibri"/>
         </w:rPr>
         <w:t xml:space="preserve"> Alison - </w:t>
-      </w:r>
-      <w:hyperlink r:id="rId13">
-        <w:r>
-          <w:rPr>
-            <w:color w:val="12628F"/>
-            <w:u w:val="single"/>
-            <w:rFonts w:ascii="Calibri" w:hAnsi="Calibri"/>
-          </w:rPr>
-          <w:t>Open the course</w:t>
-        </w:r>
-      </w:hyperlink>
-    </w:p>
-    <w:p>
-      <w:pPr>
-        <w:pStyle w:val="ListBullet"/>
-        <w:spacing w:after="60"/>
-      </w:pPr>
-      <w:r>
-        <w:rPr>
-          <w:rFonts w:ascii="Calibri" w:hAnsi="Calibri"/>
-          <w:b/>
-        </w:rPr>
-        <w:t>Format:</w:t>
-      </w:r>
-      <w:r>
-        <w:rPr>
-          <w:rFonts w:ascii="Calibri" w:hAnsi="Calibri"/>
-        </w:rPr>
-        <w:t xml:space="preserve"> Free video diploma course</w:t>
-      </w:r>
-    </w:p>
-    <w:p>
-      <w:pPr>
-        <w:pStyle w:val="ListBullet"/>
-        <w:spacing w:after="60"/>
-      </w:pPr>
-      <w:r>
-        <w:rPr>
-          <w:rFonts w:ascii="Calibri" w:hAnsi="Calibri"/>
-          <w:b/>
-        </w:rPr>
-        <w:t>Cost and access:</w:t>
-      </w:r>
-      <w:r>
-        <w:rPr>
-          <w:rFonts w:ascii="Calibri" w:hAnsi="Calibri"/>
-        </w:rPr>
-        <w:t xml:space="preserve"> Free to study; the optional certificate costs extra</w:t>
-      </w:r>
-    </w:p>
-    <w:p>
-      <w:pPr>
-        <w:pStyle w:val="ListBullet"/>
-        <w:spacing w:after="60"/>
-      </w:pPr>
-      <w:r>
-        <w:rPr>
-          <w:rFonts w:ascii="Calibri" w:hAnsi="Calibri"/>
-          <w:b/>
-        </w:rPr>
-        <w:t>Time:</w:t>
-      </w:r>
-      <w:r>
-        <w:rPr>
-          <w:rFonts w:ascii="Calibri" w:hAnsi="Calibri"/>
-        </w:rPr>
-        <w:t xml:space="preserve"> 10-15 hours</w:t>
-      </w:r>
-    </w:p>
-    <w:p>
-      <w:pPr>
-        <w:pStyle w:val="ListBullet"/>
-        <w:spacing w:after="60"/>
-      </w:pPr>
-      <w:r>
-        <w:rPr>
-          <w:rFonts w:ascii="Calibri" w:hAnsi="Calibri"/>
-          <w:b/>
-        </w:rPr>
-        <w:t>What it teaches, and why this stage:</w:t>
-      </w:r>
-      <w:r>
-        <w:rPr>
-          <w:rFonts w:ascii="Calibri" w:hAnsi="Calibri"/>
-        </w:rPr>
-        <w:t xml:space="preserve"> A video-led alternative to the text-heavy OpenLearn course. It covers the key skills and responsibilities of HR, recruitment and selection, and employee separation.</w:t>
-      </w:r>
-    </w:p>
-    <w:p>
-      <w:pPr>
-        <w:pStyle w:val="ListBullet"/>
-        <w:spacing w:after="60"/>
-      </w:pPr>
-      <w:r>
-        <w:rPr>
-          <w:rFonts w:ascii="Calibri" w:hAnsi="Calibri"/>
-          <w:b/>
-        </w:rPr>
-        <w:t>Next action:</w:t>
-      </w:r>
-      <w:r>
-        <w:rPr>
-          <w:rFonts w:ascii="Calibri" w:hAnsi="Calibri"/>
-        </w:rPr>
-        <w:t xml:space="preserve"> Use it for revision: watch the recruitment and selection modules and compare the sequence with OpenLearn section 4.</w:t>
-      </w:r>
-    </w:p>
-    <w:p>
-      <w:pPr>
-        <w:pStyle w:val="ListBullet"/>
-        <w:spacing w:after="60"/>
-      </w:pPr>
-      <w:r>
-        <w:rPr>
-          <w:rFonts w:ascii="Calibri" w:hAnsi="Calibri"/>
-          <w:b/>
-        </w:rPr>
-        <w:t>Verification:</w:t>
-      </w:r>
-      <w:r>
-        <w:rPr>
-          <w:rFonts w:ascii="Calibri" w:hAnsi="Calibri"/>
-        </w:rPr>
-        <w:t xml:space="preserve"> Verified 2026-10-26 on Alison's help centre and certification page: all courses are free to study and complete; a paid digital or printed certificate is optional and a free Learner Record is available instead. The provider page did not show an exact certificate price, so I am not quoting one. Alison lists 15 free recruitment courses on its recruitment tag page.</w:t>
-      </w:r>
-    </w:p>
-    <w:p>
-      <w:pPr>
-        <w:pStyle w:val="Heading3"/>
-      </w:pPr>
-      <w:r>
-        <w:rPr>
-          <w:rFonts w:ascii="Calibri" w:hAnsi="Calibri"/>
-        </w:rPr>
-        <w:t>BUS301: Human Resource Management</w:t>
-      </w:r>
-    </w:p>
-    <w:p>
-      <w:pPr>
-        <w:pStyle w:val="ListBullet"/>
-        <w:spacing w:after="60"/>
-      </w:pPr>
-      <w:r>
-        <w:rPr>
-          <w:rFonts w:ascii="Calibri" w:hAnsi="Calibri"/>
-          <w:b/>
-        </w:rPr>
-        <w:t>Provider and link:</w:t>
-      </w:r>
-      <w:r>
-        <w:rPr>
-          <w:rFonts w:ascii="Calibri" w:hAnsi="Calibri"/>
-        </w:rPr>
-        <w:t xml:space="preserve"> Saylor University - </w:t>
       </w:r>
       <w:hyperlink r:id="rId14">
         <w:r>
@@ -2330,7 +2330,7 @@
         <w:rPr>
           <w:rFonts w:ascii="Calibri" w:hAnsi="Calibri"/>
         </w:rPr>
-        <w:t xml:space="preserve"> Written course with lectures and videos</w:t>
+        <w:t xml:space="preserve"> Free video diploma course</w:t>
       </w:r>
     </w:p>
     <w:p>
@@ -2349,7 +2349,7 @@
         <w:rPr>
           <w:rFonts w:ascii="Calibri" w:hAnsi="Calibri"/>
         </w:rPr>
-        <w:t xml:space="preserve"> Free, with a free completion certificate</w:t>
+        <w:t xml:space="preserve"> Free to study; the optional certificate costs extra</w:t>
       </w:r>
     </w:p>
     <w:p>
@@ -2368,7 +2368,7 @@
         <w:rPr>
           <w:rFonts w:ascii="Calibri" w:hAnsi="Calibri"/>
         </w:rPr>
-        <w:t xml:space="preserve"> About 24 hours for the full course</w:t>
+        <w:t xml:space="preserve"> 10-15 hours</w:t>
       </w:r>
     </w:p>
     <w:p>
@@ -2387,7 +2387,7 @@
         <w:rPr>
           <w:rFonts w:ascii="Calibri" w:hAnsi="Calibri"/>
         </w:rPr>
-        <w:t xml:space="preserve"> A deeper follow-on to PRDV226 with strategic HR planning, staffing, compliance and labour relations. Use selected units rather than the whole course if you are short on time.</w:t>
+        <w:t xml:space="preserve"> A video-led alternative to the text-heavy OpenLearn course. It covers the key skills and responsibilities of HR, recruitment and selection, and employee separation.</w:t>
       </w:r>
     </w:p>
     <w:p>
@@ -2406,7 +2406,7 @@
         <w:rPr>
           <w:rFonts w:ascii="Calibri" w:hAnsi="Calibri"/>
         </w:rPr>
-        <w:t xml:space="preserve"> Read the staffing and recruitment/selection units only; skip performance and compensation units until you are job hunting.</w:t>
+        <w:t xml:space="preserve"> Use it for revision: watch the recruitment and selection modules and compare the sequence with OpenLearn section 4.</w:t>
       </w:r>
     </w:p>
     <w:p>
@@ -2425,7 +2425,7 @@
         <w:rPr>
           <w:rFonts w:ascii="Calibri" w:hAnsi="Calibri"/>
         </w:rPr>
-        <w:t xml:space="preserve"> Verified 2026-10-26 via the Saylor FAQ and course syllabus: no tuition or fees, free final exam and free completion certificate. The US employment-law material is not Nigerian law.</w:t>
+        <w:t xml:space="preserve"> Verified 2026-10-26 on Alison's help centre and certification page: all courses are free to study and complete; a paid digital or printed certificate is optional and a free Learner Record is available instead. The provider page did not show an exact certificate price, so I am not quoting one. Alison lists 15 free recruitment courses on its recruitment tag page.</w:t>
       </w:r>
     </w:p>
     <w:p>
@@ -2436,7 +2436,7 @@
         <w:rPr>
           <w:rFonts w:ascii="Calibri" w:hAnsi="Calibri"/>
         </w:rPr>
-        <w:t>Recruiting, Hiring, and Onboarding Employees (audit option)</w:t>
+        <w:t>BUS301: Human Resource Management</w:t>
       </w:r>
     </w:p>
     <w:p>
@@ -2455,9 +2455,163 @@
         <w:rPr>
           <w:rFonts w:ascii="Calibri" w:hAnsi="Calibri"/>
         </w:rPr>
+        <w:t xml:space="preserve"> Saylor University - </w:t>
+      </w:r>
+      <w:hyperlink r:id="rId15">
+        <w:r>
+          <w:rPr>
+            <w:color w:val="12628F"/>
+            <w:u w:val="single"/>
+            <w:rFonts w:ascii="Calibri" w:hAnsi="Calibri"/>
+          </w:rPr>
+          <w:t>Open the course</w:t>
+        </w:r>
+      </w:hyperlink>
+    </w:p>
+    <w:p>
+      <w:pPr>
+        <w:pStyle w:val="ListBullet"/>
+        <w:spacing w:after="60"/>
+      </w:pPr>
+      <w:r>
+        <w:rPr>
+          <w:rFonts w:ascii="Calibri" w:hAnsi="Calibri"/>
+          <w:b/>
+        </w:rPr>
+        <w:t>Format:</w:t>
+      </w:r>
+      <w:r>
+        <w:rPr>
+          <w:rFonts w:ascii="Calibri" w:hAnsi="Calibri"/>
+        </w:rPr>
+        <w:t xml:space="preserve"> Written course with lectures and videos</w:t>
+      </w:r>
+    </w:p>
+    <w:p>
+      <w:pPr>
+        <w:pStyle w:val="ListBullet"/>
+        <w:spacing w:after="60"/>
+      </w:pPr>
+      <w:r>
+        <w:rPr>
+          <w:rFonts w:ascii="Calibri" w:hAnsi="Calibri"/>
+          <w:b/>
+        </w:rPr>
+        <w:t>Cost and access:</w:t>
+      </w:r>
+      <w:r>
+        <w:rPr>
+          <w:rFonts w:ascii="Calibri" w:hAnsi="Calibri"/>
+        </w:rPr>
+        <w:t xml:space="preserve"> Free, with a free completion certificate</w:t>
+      </w:r>
+    </w:p>
+    <w:p>
+      <w:pPr>
+        <w:pStyle w:val="ListBullet"/>
+        <w:spacing w:after="60"/>
+      </w:pPr>
+      <w:r>
+        <w:rPr>
+          <w:rFonts w:ascii="Calibri" w:hAnsi="Calibri"/>
+          <w:b/>
+        </w:rPr>
+        <w:t>Time:</w:t>
+      </w:r>
+      <w:r>
+        <w:rPr>
+          <w:rFonts w:ascii="Calibri" w:hAnsi="Calibri"/>
+        </w:rPr>
+        <w:t xml:space="preserve"> About 24 hours for the full course</w:t>
+      </w:r>
+    </w:p>
+    <w:p>
+      <w:pPr>
+        <w:pStyle w:val="ListBullet"/>
+        <w:spacing w:after="60"/>
+      </w:pPr>
+      <w:r>
+        <w:rPr>
+          <w:rFonts w:ascii="Calibri" w:hAnsi="Calibri"/>
+          <w:b/>
+        </w:rPr>
+        <w:t>What it teaches, and why this stage:</w:t>
+      </w:r>
+      <w:r>
+        <w:rPr>
+          <w:rFonts w:ascii="Calibri" w:hAnsi="Calibri"/>
+        </w:rPr>
+        <w:t xml:space="preserve"> A deeper follow-on to PRDV226 with strategic HR planning, staffing, compliance and labour relations. Use selected units rather than the whole course if you are short on time.</w:t>
+      </w:r>
+    </w:p>
+    <w:p>
+      <w:pPr>
+        <w:pStyle w:val="ListBullet"/>
+        <w:spacing w:after="60"/>
+      </w:pPr>
+      <w:r>
+        <w:rPr>
+          <w:rFonts w:ascii="Calibri" w:hAnsi="Calibri"/>
+          <w:b/>
+        </w:rPr>
+        <w:t>Next action:</w:t>
+      </w:r>
+      <w:r>
+        <w:rPr>
+          <w:rFonts w:ascii="Calibri" w:hAnsi="Calibri"/>
+        </w:rPr>
+        <w:t xml:space="preserve"> Read the staffing and recruitment/selection units only; skip performance and compensation units until you are job hunting.</w:t>
+      </w:r>
+    </w:p>
+    <w:p>
+      <w:pPr>
+        <w:pStyle w:val="ListBullet"/>
+        <w:spacing w:after="60"/>
+      </w:pPr>
+      <w:r>
+        <w:rPr>
+          <w:rFonts w:ascii="Calibri" w:hAnsi="Calibri"/>
+          <w:b/>
+        </w:rPr>
+        <w:t>Verification:</w:t>
+      </w:r>
+      <w:r>
+        <w:rPr>
+          <w:rFonts w:ascii="Calibri" w:hAnsi="Calibri"/>
+        </w:rPr>
+        <w:t xml:space="preserve"> Verified 2026-10-26 via the Saylor FAQ and course syllabus: no tuition or fees, free final exam and free completion certificate. The US employment-law material is not Nigerian law.</w:t>
+      </w:r>
+    </w:p>
+    <w:p>
+      <w:pPr>
+        <w:pStyle w:val="Heading3"/>
+      </w:pPr>
+      <w:r>
+        <w:rPr>
+          <w:rFonts w:ascii="Calibri" w:hAnsi="Calibri"/>
+        </w:rPr>
+        <w:t>Recruiting, Hiring, and Onboarding Employees (audit option)</w:t>
+      </w:r>
+    </w:p>
+    <w:p>
+      <w:pPr>
+        <w:pStyle w:val="ListBullet"/>
+        <w:spacing w:after="60"/>
+      </w:pPr>
+      <w:r>
+        <w:rPr>
+          <w:rFonts w:ascii="Calibri" w:hAnsi="Calibri"/>
+          <w:b/>
+        </w:rPr>
+        <w:t>Provider and link:</w:t>
+      </w:r>
+      <w:r>
+        <w:rPr>
+          <w:rFonts w:ascii="Calibri" w:hAnsi="Calibri"/>
+        </w:rPr>
         <w:t xml:space="preserve"> University of Minnesota on Coursera - </w:t>
       </w:r>
-      <w:hyperlink r:id="rId15">
+      <w:hyperlink r:id="rId16">
         <w:r>
           <w:rPr>
             <w:color w:val="12628F"/>
@@ -2735,7 +2889,7 @@
         </w:rPr>
         <w:t xml:space="preserve"> US Department of Labor - </w:t>
       </w:r>
-      <w:hyperlink r:id="rId16">
+      <w:hyperlink r:id="rId17">
         <w:r>
           <w:rPr>
             <w:color w:val="12628F"/>
@@ -2889,7 +3043,7 @@
         </w:rPr>
         <w:t xml:space="preserve"> Workable - </w:t>
       </w:r>
-      <w:hyperlink r:id="rId17">
+      <w:hyperlink r:id="rId18">
         <w:r>
           <w:rPr>
             <w:color w:val="12628F"/>
@@ -3043,7 +3197,7 @@
         </w:rPr>
         <w:t xml:space="preserve"> Greenhouse Support - </w:t>
       </w:r>
-      <w:hyperlink r:id="rId18">
+      <w:hyperlink r:id="rId19">
         <w:r>
           <w:rPr>
             <w:color w:val="12628F"/>
@@ -3321,7 +3475,7 @@
         </w:rPr>
         <w:t xml:space="preserve"> Workable - </w:t>
       </w:r>
-      <w:hyperlink r:id="rId19">
+      <w:hyperlink r:id="rId20">
         <w:r>
           <w:rPr>
             <w:color w:val="12628F"/>
@@ -3475,7 +3629,7 @@
         </w:rPr>
         <w:t xml:space="preserve"> HR Learning Lab (YouTube) - </w:t>
       </w:r>
-      <w:hyperlink r:id="rId20">
+      <w:hyperlink r:id="rId21">
         <w:r>
           <w:rPr>
             <w:color w:val="12628F"/>
@@ -3629,7 +3783,7 @@
         </w:rPr>
         <w:t xml:space="preserve"> Google re:Work - </w:t>
       </w:r>
-      <w:hyperlink r:id="rId21">
+      <w:hyperlink r:id="rId22">
         <w:r>
           <w:rPr>
             <w:color w:val="12628F"/>
@@ -3783,7 +3937,7 @@
         </w:rPr>
         <w:t xml:space="preserve"> Jobberman Nigeria - </w:t>
       </w:r>
-      <w:hyperlink r:id="rId22">
+      <w:hyperlink r:id="rId23">
         <w:r>
           <w:rPr>
             <w:color w:val="12628F"/>
@@ -4061,7 +4215,7 @@
         </w:rPr>
         <w:t xml:space="preserve"> Google re:Work - </w:t>
       </w:r>
-      <w:hyperlink r:id="rId21">
+      <w:hyperlink r:id="rId22">
         <w:r>
           <w:rPr>
             <w:color w:val="12628F"/>
@@ -4215,7 +4369,7 @@
         </w:rPr>
         <w:t xml:space="preserve"> Greenhouse - </w:t>
       </w:r>
-      <w:hyperlink r:id="rId23">
+      <w:hyperlink r:id="rId24">
         <w:r>
           <w:rPr>
             <w:color w:val="12628F"/>
@@ -4369,7 +4523,7 @@
         </w:rPr>
         <w:t xml:space="preserve"> The Open University (OpenLearn) - </w:t>
       </w:r>
-      <w:hyperlink r:id="rId12">
+      <w:hyperlink r:id="rId13">
         <w:r>
           <w:rPr>
             <w:color w:val="12628F"/>
@@ -4627,160 +4781,6 @@
           <w:rFonts w:ascii="Calibri" w:hAnsi="Calibri"/>
         </w:rPr>
         <w:t>A guide to structured interviewing for better hiring practices</w:t>
-      </w:r>
-    </w:p>
-    <w:p>
-      <w:pPr>
-        <w:pStyle w:val="ListBullet"/>
-        <w:spacing w:after="60"/>
-      </w:pPr>
-      <w:r>
-        <w:rPr>
-          <w:rFonts w:ascii="Calibri" w:hAnsi="Calibri"/>
-          <w:b/>
-        </w:rPr>
-        <w:t>Provider and link:</w:t>
-      </w:r>
-      <w:r>
-        <w:rPr>
-          <w:rFonts w:ascii="Calibri" w:hAnsi="Calibri"/>
-        </w:rPr>
-        <w:t xml:space="preserve"> Google re:Work - </w:t>
-      </w:r>
-      <w:hyperlink r:id="rId24">
-        <w:r>
-          <w:rPr>
-            <w:color w:val="12628F"/>
-            <w:u w:val="single"/>
-            <w:rFonts w:ascii="Calibri" w:hAnsi="Calibri"/>
-          </w:rPr>
-          <w:t>Read the guide</w:t>
-        </w:r>
-      </w:hyperlink>
-    </w:p>
-    <w:p>
-      <w:pPr>
-        <w:pStyle w:val="ListBullet"/>
-        <w:spacing w:after="60"/>
-      </w:pPr>
-      <w:r>
-        <w:rPr>
-          <w:rFonts w:ascii="Calibri" w:hAnsi="Calibri"/>
-          <w:b/>
-        </w:rPr>
-        <w:t>Format:</w:t>
-      </w:r>
-      <w:r>
-        <w:rPr>
-          <w:rFonts w:ascii="Calibri" w:hAnsi="Calibri"/>
-        </w:rPr>
-        <w:t xml:space="preserve"> Free official practice guide</w:t>
-      </w:r>
-    </w:p>
-    <w:p>
-      <w:pPr>
-        <w:pStyle w:val="ListBullet"/>
-        <w:spacing w:after="60"/>
-      </w:pPr>
-      <w:r>
-        <w:rPr>
-          <w:rFonts w:ascii="Calibri" w:hAnsi="Calibri"/>
-          <w:b/>
-        </w:rPr>
-        <w:t>Cost and access:</w:t>
-      </w:r>
-      <w:r>
-        <w:rPr>
-          <w:rFonts w:ascii="Calibri" w:hAnsi="Calibri"/>
-        </w:rPr>
-        <w:t xml:space="preserve"> Free</w:t>
-      </w:r>
-    </w:p>
-    <w:p>
-      <w:pPr>
-        <w:pStyle w:val="ListBullet"/>
-        <w:spacing w:after="60"/>
-      </w:pPr>
-      <w:r>
-        <w:rPr>
-          <w:rFonts w:ascii="Calibri" w:hAnsi="Calibri"/>
-          <w:b/>
-        </w:rPr>
-        <w:t>Time:</w:t>
-      </w:r>
-      <w:r>
-        <w:rPr>
-          <w:rFonts w:ascii="Calibri" w:hAnsi="Calibri"/>
-        </w:rPr>
-        <w:t xml:space="preserve"> About 2 hours</w:t>
-      </w:r>
-    </w:p>
-    <w:p>
-      <w:pPr>
-        <w:pStyle w:val="ListBullet"/>
-        <w:spacing w:after="60"/>
-      </w:pPr>
-      <w:r>
-        <w:rPr>
-          <w:rFonts w:ascii="Calibri" w:hAnsi="Calibri"/>
-          <w:b/>
-        </w:rPr>
-        <w:t>What it teaches, and why this stage:</w:t>
-      </w:r>
-      <w:r>
-        <w:rPr>
-          <w:rFonts w:ascii="Calibri" w:hAnsi="Calibri"/>
-        </w:rPr>
-        <w:t xml:space="preserve"> The most important single document in this library. Updated in March 2026, it explains the four parts of structured interviewing, how to define hiring attributes, how to draft questions and follow-ups, and how to score with a shared rubric.</w:t>
-      </w:r>
-    </w:p>
-    <w:p>
-      <w:pPr>
-        <w:pStyle w:val="ListBullet"/>
-        <w:spacing w:after="60"/>
-      </w:pPr>
-      <w:r>
-        <w:rPr>
-          <w:rFonts w:ascii="Calibri" w:hAnsi="Calibri"/>
-          <w:b/>
-        </w:rPr>
-        <w:t>Next action:</w:t>
-      </w:r>
-      <w:r>
-        <w:rPr>
-          <w:rFonts w:ascii="Calibri" w:hAnsi="Calibri"/>
-        </w:rPr>
-        <w:t xml:space="preserve"> Write eight questions for your practice role: four behavioural and four hypothetical, each mapped to a scorecard attribute. Add what a poor and an outstanding answer would sound like.</w:t>
-      </w:r>
-    </w:p>
-    <w:p>
-      <w:pPr>
-        <w:pStyle w:val="ListBullet"/>
-        <w:spacing w:after="60"/>
-      </w:pPr>
-      <w:r>
-        <w:rPr>
-          <w:rFonts w:ascii="Calibri" w:hAnsi="Calibri"/>
-          <w:b/>
-        </w:rPr>
-        <w:t>Verification:</w:t>
-      </w:r>
-      <w:r>
-        <w:rPr>
-          <w:rFonts w:ascii="Calibri" w:hAnsi="Calibri"/>
-        </w:rPr>
-        <w:t xml:space="preserve"> Verified 2026-10-26 by reading the provider page: marked Updated March 2026, free, no login or payment shown. Google reports these results from its own hiring data; the method is widely supported by research, but the specific numbers are not a promise for your context.</w:t>
-      </w:r>
-    </w:p>
-    <w:p>
-      <w:pPr>
-        <w:pStyle w:val="Heading3"/>
-      </w:pPr>
-      <w:r>
-        <w:rPr>
-          <w:rFonts w:ascii="Calibri" w:hAnsi="Calibri"/>
-        </w:rPr>
-        <w:t>Effective interviewer training for better candidate experiences</w:t>
       </w:r>
     </w:p>
     <w:p>
@@ -4866,7 +4866,7 @@
         <w:rPr>
           <w:rFonts w:ascii="Calibri" w:hAnsi="Calibri"/>
         </w:rPr>
-        <w:t xml:space="preserve"> About 1 hour</w:t>
+        <w:t xml:space="preserve"> About 2 hours</w:t>
       </w:r>
     </w:p>
     <w:p>
@@ -4885,7 +4885,7 @@
         <w:rPr>
           <w:rFonts w:ascii="Calibri" w:hAnsi="Calibri"/>
         </w:rPr>
-        <w:t xml:space="preserve"> Shows how to write useful interview feedback, avoid vague comments and personality judgements, and leave time for candidate questions. This is what makes a rubric work in a real panel.</w:t>
+        <w:t xml:space="preserve"> The most important single document in this library. Updated in March 2026, it explains the four parts of structured interviewing, how to define hiring attributes, how to draft questions and follow-ups, and how to score with a shared rubric.</w:t>
       </w:r>
     </w:p>
     <w:p>
@@ -4904,7 +4904,7 @@
         <w:rPr>
           <w:rFonts w:ascii="Calibri" w:hAnsi="Calibri"/>
         </w:rPr>
-        <w:t xml:space="preserve"> After your mock interview, rewrite your feedback using the guide's rules and check whether a stranger could reconstruct the evidence.</w:t>
+        <w:t xml:space="preserve"> Write eight questions for your practice role: four behavioural and four hypothetical, each mapped to a scorecard attribute. Add what a poor and an outstanding answer would sound like.</w:t>
       </w:r>
     </w:p>
     <w:p>
@@ -4923,7 +4923,7 @@
         <w:rPr>
           <w:rFonts w:ascii="Calibri" w:hAnsi="Calibri"/>
         </w:rPr>
-        <w:t xml:space="preserve"> Verified via the provider's own page content returned in search results on 2026-10-26; the guide is part of the same free re:Work set. The page itself was not opened directly, so individual steps were not fully read.</w:t>
+        <w:t xml:space="preserve"> Verified 2026-10-26 by reading the provider page: marked Updated March 2026, free, no login or payment shown. Google reports these results from its own hiring data; the method is widely supported by research, but the specific numbers are not a promise for your context.</w:t>
       </w:r>
     </w:p>
     <w:p>
@@ -4934,7 +4934,7 @@
         <w:rPr>
           <w:rFonts w:ascii="Calibri" w:hAnsi="Calibri"/>
         </w:rPr>
-        <w:t>Reuse: Greenhouse structured hiring introduction and Workable interview kits</w:t>
+        <w:t>Effective interviewer training for better candidate experiences</w:t>
       </w:r>
     </w:p>
     <w:p>
@@ -4953,9 +4953,163 @@
         <w:rPr>
           <w:rFonts w:ascii="Calibri" w:hAnsi="Calibri"/>
         </w:rPr>
+        <w:t xml:space="preserve"> Google re:Work - </w:t>
+      </w:r>
+      <w:hyperlink r:id="rId26">
+        <w:r>
+          <w:rPr>
+            <w:color w:val="12628F"/>
+            <w:u w:val="single"/>
+            <w:rFonts w:ascii="Calibri" w:hAnsi="Calibri"/>
+          </w:rPr>
+          <w:t>Read the guide</w:t>
+        </w:r>
+      </w:hyperlink>
+    </w:p>
+    <w:p>
+      <w:pPr>
+        <w:pStyle w:val="ListBullet"/>
+        <w:spacing w:after="60"/>
+      </w:pPr>
+      <w:r>
+        <w:rPr>
+          <w:rFonts w:ascii="Calibri" w:hAnsi="Calibri"/>
+          <w:b/>
+        </w:rPr>
+        <w:t>Format:</w:t>
+      </w:r>
+      <w:r>
+        <w:rPr>
+          <w:rFonts w:ascii="Calibri" w:hAnsi="Calibri"/>
+        </w:rPr>
+        <w:t xml:space="preserve"> Free official practice guide</w:t>
+      </w:r>
+    </w:p>
+    <w:p>
+      <w:pPr>
+        <w:pStyle w:val="ListBullet"/>
+        <w:spacing w:after="60"/>
+      </w:pPr>
+      <w:r>
+        <w:rPr>
+          <w:rFonts w:ascii="Calibri" w:hAnsi="Calibri"/>
+          <w:b/>
+        </w:rPr>
+        <w:t>Cost and access:</w:t>
+      </w:r>
+      <w:r>
+        <w:rPr>
+          <w:rFonts w:ascii="Calibri" w:hAnsi="Calibri"/>
+        </w:rPr>
+        <w:t xml:space="preserve"> Free</w:t>
+      </w:r>
+    </w:p>
+    <w:p>
+      <w:pPr>
+        <w:pStyle w:val="ListBullet"/>
+        <w:spacing w:after="60"/>
+      </w:pPr>
+      <w:r>
+        <w:rPr>
+          <w:rFonts w:ascii="Calibri" w:hAnsi="Calibri"/>
+          <w:b/>
+        </w:rPr>
+        <w:t>Time:</w:t>
+      </w:r>
+      <w:r>
+        <w:rPr>
+          <w:rFonts w:ascii="Calibri" w:hAnsi="Calibri"/>
+        </w:rPr>
+        <w:t xml:space="preserve"> About 1 hour</w:t>
+      </w:r>
+    </w:p>
+    <w:p>
+      <w:pPr>
+        <w:pStyle w:val="ListBullet"/>
+        <w:spacing w:after="60"/>
+      </w:pPr>
+      <w:r>
+        <w:rPr>
+          <w:rFonts w:ascii="Calibri" w:hAnsi="Calibri"/>
+          <w:b/>
+        </w:rPr>
+        <w:t>What it teaches, and why this stage:</w:t>
+      </w:r>
+      <w:r>
+        <w:rPr>
+          <w:rFonts w:ascii="Calibri" w:hAnsi="Calibri"/>
+        </w:rPr>
+        <w:t xml:space="preserve"> Shows how to write useful interview feedback, avoid vague comments and personality judgements, and leave time for candidate questions. This is what makes a rubric work in a real panel.</w:t>
+      </w:r>
+    </w:p>
+    <w:p>
+      <w:pPr>
+        <w:pStyle w:val="ListBullet"/>
+        <w:spacing w:after="60"/>
+      </w:pPr>
+      <w:r>
+        <w:rPr>
+          <w:rFonts w:ascii="Calibri" w:hAnsi="Calibri"/>
+          <w:b/>
+        </w:rPr>
+        <w:t>Next action:</w:t>
+      </w:r>
+      <w:r>
+        <w:rPr>
+          <w:rFonts w:ascii="Calibri" w:hAnsi="Calibri"/>
+        </w:rPr>
+        <w:t xml:space="preserve"> After your mock interview, rewrite your feedback using the guide's rules and check whether a stranger could reconstruct the evidence.</w:t>
+      </w:r>
+    </w:p>
+    <w:p>
+      <w:pPr>
+        <w:pStyle w:val="ListBullet"/>
+        <w:spacing w:after="60"/>
+      </w:pPr>
+      <w:r>
+        <w:rPr>
+          <w:rFonts w:ascii="Calibri" w:hAnsi="Calibri"/>
+          <w:b/>
+        </w:rPr>
+        <w:t>Verification:</w:t>
+      </w:r>
+      <w:r>
+        <w:rPr>
+          <w:rFonts w:ascii="Calibri" w:hAnsi="Calibri"/>
+        </w:rPr>
+        <w:t xml:space="preserve"> Verified via the provider's own page content returned in search results on 2026-10-26; the guide is part of the same free re:Work set. The page itself was not opened directly, so individual steps were not fully read.</w:t>
+      </w:r>
+    </w:p>
+    <w:p>
+      <w:pPr>
+        <w:pStyle w:val="Heading3"/>
+      </w:pPr>
+      <w:r>
+        <w:rPr>
+          <w:rFonts w:ascii="Calibri" w:hAnsi="Calibri"/>
+        </w:rPr>
+        <w:t>Reuse: Greenhouse structured hiring introduction and Workable interview kits</w:t>
+      </w:r>
+    </w:p>
+    <w:p>
+      <w:pPr>
+        <w:pStyle w:val="ListBullet"/>
+        <w:spacing w:after="60"/>
+      </w:pPr>
+      <w:r>
+        <w:rPr>
+          <w:rFonts w:ascii="Calibri" w:hAnsi="Calibri"/>
+          <w:b/>
+        </w:rPr>
+        <w:t>Provider and link:</w:t>
+      </w:r>
+      <w:r>
+        <w:rPr>
+          <w:rFonts w:ascii="Calibri" w:hAnsi="Calibri"/>
+        </w:rPr>
         <w:t xml:space="preserve"> Greenhouse and Workable - </w:t>
       </w:r>
-      <w:hyperlink r:id="rId18">
+      <w:hyperlink r:id="rId19">
         <w:r>
           <w:rPr>
             <w:color w:val="12628F"/>
@@ -5233,7 +5387,7 @@
         </w:rPr>
         <w:t xml:space="preserve"> Nigeria Data Protection Commission (NDPC) - </w:t>
       </w:r>
-      <w:hyperlink r:id="rId26">
+      <w:hyperlink r:id="rId27">
         <w:r>
           <w:rPr>
             <w:color w:val="12628F"/>
@@ -5387,7 +5541,7 @@
         </w:rPr>
         <w:t xml:space="preserve"> PLAC Laws of Nigeria (statute copy); ILO NATLEX listing - </w:t>
       </w:r>
-      <w:hyperlink r:id="rId27">
+      <w:hyperlink r:id="rId28">
         <w:r>
           <w:rPr>
             <w:color w:val="12628F"/>
@@ -5541,7 +5695,7 @@
         </w:rPr>
         <w:t xml:space="preserve"> Google re:Work - </w:t>
       </w:r>
-      <w:hyperlink r:id="rId21">
+      <w:hyperlink r:id="rId22">
         <w:r>
           <w:rPr>
             <w:color w:val="12628F"/>
@@ -5819,7 +5973,7 @@
         </w:rPr>
         <w:t xml:space="preserve"> HubSpot Academy - </w:t>
       </w:r>
-      <w:hyperlink r:id="rId28">
+      <w:hyperlink r:id="rId29">
         <w:r>
           <w:rPr>
             <w:color w:val="12628F"/>
@@ -5973,7 +6127,7 @@
         </w:rPr>
         <w:t xml:space="preserve"> Greenhouse - </w:t>
       </w:r>
-      <w:hyperlink r:id="rId23">
+      <w:hyperlink r:id="rId24">
         <w:r>
           <w:rPr>
             <w:color w:val="12628F"/>
@@ -6127,7 +6281,7 @@
         </w:rPr>
         <w:t xml:space="preserve"> Chartered Institute of Personnel Management of Nigeria - </w:t>
       </w:r>
-      <w:hyperlink r:id="rId29">
+      <w:hyperlink r:id="rId30">
         <w:r>
           <w:rPr>
             <w:color w:val="12628F"/>
@@ -7974,7 +8128,7 @@
       </w:r>
     </w:p>
     <w:sectPr>
-      <w:footerReference w:type="default" r:id="rId30"/>
+      <w:footerReference w:type="default" r:id="rId31"/>
       <w:pgSz w:w="12240" w:h="15840"/>
       <w:pgMar w:top="936" w:right="1008" w:bottom="936" w:left="1008" w:header="720" w:footer="720" w:gutter="0"/>
       <w:cols w:space="720"/>

</xml_diff>